<commit_message>
Docs: append January 2026 GL comparison notes and open policy questions
</commit_message>
<xml_diff>
--- a/GA_Pipeline_Overview.docx
+++ b/GA_Pipeline_Overview.docx
@@ -1368,6 +1368,173 @@
       <w:pgNumType/>
       <w:docGrid w:linePitch="360"/>
     </w:sectPr>
+    <w:p>
+      <w:r>
+        <w:rPr>
+          <w:rFonts w:ascii="Calibri" w:cs="Calibri" w:eastAsia="Calibri" w:hAnsi="Calibri"/>
+          <w:sz w:val="22"/>
+          <w:szCs w:val="22"/>
+        </w:rPr>
+        <w:t/>
+      </w:r>
+    </w:p>
+    <w:p>
+      <w:r>
+        <w:rPr>
+          <w:b/>
+          <w:rFonts w:ascii="Calibri" w:cs="Calibri" w:eastAsia="Calibri" w:hAnsi="Calibri"/>
+          <w:b/>
+          <w:bCs/>
+          <w:sz w:val="22"/>
+          <w:szCs w:val="22"/>
+        </w:rPr>
+        <w:t>January 2026 Pipeline vs. Final GL — Comparison Notes</w:t>
+      </w:r>
+    </w:p>
+    <w:p>
+      <w:r>
+        <w:rPr>
+          <w:rFonts w:ascii="Calibri" w:cs="Calibri" w:eastAsia="Calibri" w:hAnsi="Calibri"/>
+          <w:sz w:val="22"/>
+          <w:szCs w:val="22"/>
+        </w:rPr>
+        <w:t>In comparing the pipeline-generated GL against the January 2026 final post-close GL, four areas were identified for confirmation. Three were resolved; one remains an open accounting policy question:</w:t>
+      </w:r>
+    </w:p>
+    <w:p>
+      <w:pPr>
+        <w:pStyle w:val="ListParagraph"/>
+        <w:numPr>
+          <w:ilvl w:val="0"/>
+          <w:numId w:val="2"/>
+        </w:numPr>
+        <w:spacing w:after="40" w:before="40"/>
+      </w:pPr>
+      <w:r>
+        <w:rPr>
+          <w:b/>
+          <w:rFonts w:ascii="Calibri" w:cs="Calibri" w:eastAsia="Calibri" w:hAnsi="Calibri"/>
+          <w:b/>
+          <w:bCs/>
+          <w:sz w:val="22"/>
+          <w:szCs w:val="22"/>
+        </w:rPr>
+        <w:t xml:space="preserve">CAM Recovery Routing (133100, 440100): </w:t>
+      </w:r>
+      <w:r>
+        <w:rPr>
+          <w:rFonts w:ascii="Calibri" w:cs="Calibri" w:eastAsia="Calibri" w:hAnsi="Calibri"/>
+          <w:b/>
+          <w:bCs/>
+          <w:sz w:val="22"/>
+          <w:szCs w:val="22"/>
+        </w:rPr>
+        <w:t>The difference in these accounts is driven by an auto-accrual reversal that posts on January 1. This is expected Pass 2 activity — the reversal is confirmed and no pipeline change is needed.</w:t>
+      </w:r>
+    </w:p>
+    <w:p>
+      <w:pPr>
+        <w:pStyle w:val="ListParagraph"/>
+        <w:numPr>
+          <w:ilvl w:val="0"/>
+          <w:numId w:val="2"/>
+        </w:numPr>
+        <w:spacing w:after="40" w:before="40"/>
+      </w:pPr>
+      <w:r>
+        <w:rPr>
+          <w:b/>
+          <w:rFonts w:ascii="Calibri" w:cs="Calibri" w:eastAsia="Calibri" w:hAnsi="Calibri"/>
+          <w:b/>
+          <w:bCs/>
+          <w:sz w:val="22"/>
+          <w:szCs w:val="22"/>
+        </w:rPr>
+        <w:t xml:space="preserve">Payroll Accruals (637110, 615110): </w:t>
+      </w:r>
+      <w:r>
+        <w:rPr>
+          <w:rFonts w:ascii="Calibri" w:cs="Calibri" w:eastAsia="Calibri" w:hAnsi="Calibri"/>
+          <w:b/>
+          <w:bCs/>
+          <w:sz w:val="22"/>
+          <w:szCs w:val="22"/>
+        </w:rPr>
+        <w:t>A manually-posted JE (J-19118) in the pre-close GL included large payroll accruals that were voided before the final close. The pipeline’s INV-PRORATION entries (J-20244, J-20245) — last actual payroll run prorated through month-end — were retained as the correct accrual. Confirmed: the pipeline proration method is the agreed standard going forward. Manual payroll JEs should not be posted before the pipeline runs.</w:t>
+      </w:r>
+    </w:p>
+    <w:p>
+      <w:pPr>
+        <w:pStyle w:val="ListParagraph"/>
+        <w:numPr>
+          <w:ilvl w:val="0"/>
+          <w:numId w:val="2"/>
+        </w:numPr>
+        <w:spacing w:after="40" w:before="40"/>
+      </w:pPr>
+      <w:r>
+        <w:rPr>
+          <w:b/>
+          <w:rFonts w:ascii="Calibri" w:cs="Calibri" w:eastAsia="Calibri" w:hAnsi="Calibri"/>
+          <w:b/>
+          <w:bCs/>
+          <w:sz w:val="22"/>
+          <w:szCs w:val="22"/>
+        </w:rPr>
+        <w:t xml:space="preserve">Food Service Amenities (637170): </w:t>
+      </w:r>
+      <w:r>
+        <w:rPr>
+          <w:rFonts w:ascii="Calibri" w:cs="Calibri" w:eastAsia="Calibri" w:hAnsi="Calibri"/>
+          <w:b/>
+          <w:bCs/>
+          <w:sz w:val="22"/>
+          <w:szCs w:val="22"/>
+        </w:rPr>
+        <w:t>The pipeline re-accrued $30,000 in January to offset the auto-reversal of the December food service accrual. GRP voided this re-accrual in the final close, allowing the reversal to stand. Open question: was the food service contract discontinued, or is this a one-time decision? If the expense is recurring, a monthly amount should be entered in the One-Off Accruals table each period.</w:t>
+      </w:r>
+    </w:p>
+    <w:p>
+      <w:pPr>
+        <w:pStyle w:val="ListParagraph"/>
+        <w:numPr>
+          <w:ilvl w:val="0"/>
+          <w:numId w:val="2"/>
+        </w:numPr>
+        <w:spacing w:after="40" w:before="40"/>
+      </w:pPr>
+      <w:r>
+        <w:rPr>
+          <w:b/>
+          <w:rFonts w:ascii="Calibri" w:cs="Calibri" w:eastAsia="Calibri" w:hAnsi="Calibri"/>
+          <w:b/>
+          <w:bCs/>
+          <w:sz w:val="22"/>
+          <w:szCs w:val="22"/>
+        </w:rPr>
+        <w:t xml:space="preserve">Real Estate Tax Escrow Treatment (641110): </w:t>
+      </w:r>
+      <w:r>
+        <w:rPr>
+          <w:rFonts w:ascii="Calibri" w:cs="Calibri" w:eastAsia="Calibri" w:hAnsi="Calibri"/>
+          <w:b/>
+          <w:bCs/>
+          <w:sz w:val="22"/>
+          <w:szCs w:val="22"/>
+        </w:rPr>
+        <w:t>The pipeline split the Q1 RE tax payment ($498,751) across three months — expensing January’s share ($166,250) and prepaying February and March ($332,501) to a balance sheet prepaid. GRP elected to expense the full quarterly payment in January. This will recur each payment quarter (January, April, July, October). Open question: should the pipeline spread the payment over three months, or expense in full in the payment month? Decision needed before April close.</w:t>
+      </w:r>
+    </w:p>
+    <w:p>
+      <w:r>
+        <w:rPr>
+          <w:rFonts w:ascii="Calibri" w:cs="Calibri" w:eastAsia="Calibri" w:hAnsi="Calibri"/>
+          <w:sz w:val="22"/>
+          <w:szCs w:val="22"/>
+        </w:rPr>
+        <w:t/>
+      </w:r>
+    </w:p>
   </w:body>
 </w:document>
 </file>

</xml_diff>